<commit_message>
Add universal CV package and current ASTOR robotics role
Co-authored-by: Maciej <WeaverTech@users.noreply.github.com>
</commit_message>
<xml_diff>
--- a/artifacts/inbolt-cv/Maciej_Tkacz_CV_Inbolt_EN_ATS.docx
+++ b/artifacts/inbolt-cv/Maciej_Tkacz_CV_Inbolt_EN_ATS.docx
@@ -52,7 +52,7 @@
     </w:p>
     <w:p>
       <w:r>
-        <w:t>Robotics application engineering profile: Mechanical Engineering student at Cracow University of Technology and certified Software Technician with commercial Application Engineer experience in robotics simulation and digital twins (Visual Components) for automotive clients, including Python scripting for process optimization and simulation improvements. Certified courses in industrial robot programming (Kawasaki, Epson). Built a SCARA robotic arm from scratch - CAD, 3D printing, stepper drives, microcontroller electronics and Python/C++ control software. Strong CAD modelling and 3D-printing background. Native Polish, English C1; based in Poland, available full-time and open to extensive travel to customer sites.</w:t>
+        <w:t>Robotics application engineering profile: Mechanical Engineering student at Cracow University of Technology and certified Software Technician. Currently a Robotics Engineer at ASTOR, programming Kawasaki and Epson robots, building digital twins of production lines and deploying robot demonstration stations across different applications. Earlier Application Engineer experience in robotics simulation and digital twins (Visual Components) for automotive clients, including Python scripting for process optimization and simulation improvements. Certified courses in industrial robot programming (Kawasaki, Epson). Built a SCARA robotic arm from scratch - CAD, 3D printing, stepper drives, microcontroller electronics and Python/C++ control software. Strong CAD modelling and 3D-printing background. Native Polish, English C1; based in Poland, available full-time and open to extensive travel to customer sites.</w:t>
       </w:r>
     </w:p>
     <w:p>
@@ -210,6 +210,60 @@
           <w:sz w:val="20"/>
         </w:rPr>
         <w:t>PROFESSIONAL EXPERIENCE</w:t>
+      </w:r>
+    </w:p>
+    <w:p>
+      <w:pPr>
+        <w:spacing w:before="60"/>
+      </w:pPr>
+      <w:r>
+        <w:rPr>
+          <w:b/>
+        </w:rPr>
+        <w:t>Robotics Engineer</w:t>
+      </w:r>
+      <w:r>
+        <w:t xml:space="preserve"> | ASTOR, Krakow | Jul 2026 - present</w:t>
+      </w:r>
+    </w:p>
+    <w:p>
+      <w:pPr>
+        <w:pStyle w:val="ListBullet"/>
+        <w:spacing w:after="20"/>
+        <w:ind w:left="198"/>
+      </w:pPr>
+      <w:r>
+        <w:t>Program Kawasaki and Epson industrial robots, from motion programs and teach pendant work to complete application cycles.</w:t>
+      </w:r>
+    </w:p>
+    <w:p>
+      <w:pPr>
+        <w:pStyle w:val="ListBullet"/>
+        <w:spacing w:after="20"/>
+        <w:ind w:left="198"/>
+      </w:pPr>
+      <w:r>
+        <w:t>Build digital twins of production lines and robot simulations, validating reach, motion sequences and process behaviour before physical implementation.</w:t>
+      </w:r>
+    </w:p>
+    <w:p>
+      <w:pPr>
+        <w:pStyle w:val="ListBullet"/>
+        <w:spacing w:after="20"/>
+        <w:ind w:left="198"/>
+      </w:pPr>
+      <w:r>
+        <w:t>Design, prepare and build demonstration stations presenting Kawasaki and Epson robots across different applications - mechanical assembly, hardware-software integration, programming and commissioning.</w:t>
+      </w:r>
+    </w:p>
+    <w:p>
+      <w:pPr>
+        <w:pStyle w:val="ListBullet"/>
+        <w:spacing w:after="20"/>
+        <w:ind w:left="198"/>
+      </w:pPr>
+      <w:r>
+        <w:t>Test and troubleshoot robot cells end to end, working across mechanics, electrics and robot software.</w:t>
       </w:r>
     </w:p>
     <w:p>

</xml_diff>